<commit_message>
Consumer Drip touch 5 em dash corrected in GHL
Co-Authored-By: Claude Opus 5 <noreply@anthropic.com>
</commit_message>
<xml_diff>
--- a/campaigns/consumer-drip.docx
+++ b/campaigns/consumer-drip.docx
@@ -662,40 +662,13 @@
           <w:b/>
           <w:bCs/>
         </w:rPr>
-        <w:t xml:space="preserve">EM DASH IN GHL, NEEDS CORRECTING.</w:t>
-      </w:r>
-      <w:r>
-        <w:t xml:space="preserve"> </w:t>
-      </w:r>
-      <w:r>
-        <w:t xml:space="preserve">The live subject uses an em dash between</w:t>
-      </w:r>
-      <w:r>
-        <w:t xml:space="preserve"> </w:t>
-      </w:r>
-      <w:r>
-        <w:rPr>
-          <w:rStyle w:val="VerbatimChar"/>
-        </w:rPr>
-        <w:t xml:space="preserve">ACTION REQUIRED</w:t>
-      </w:r>
-      <w:r>
-        <w:t xml:space="preserve"> </w:t>
-      </w:r>
-      <w:r>
-        <w:t xml:space="preserve">and</w:t>
-      </w:r>
-      <w:r>
-        <w:t xml:space="preserve"> </w:t>
-      </w:r>
-      <w:r>
-        <w:rPr>
-          <w:rStyle w:val="VerbatimChar"/>
-        </w:rPr>
-        <w:t xml:space="preserve">Personal Call</w:t>
-      </w:r>
-      <w:r>
-        <w:t xml:space="preserve">. Recorded above with a hyphen per the standing rule. Correct it in GHL so the two match.</w:t>
+        <w:t xml:space="preserve">Em dash in the live subject corrected in GHL, Aug 2.</w:t>
+      </w:r>
+      <w:r>
+        <w:t xml:space="preserve"> </w:t>
+      </w:r>
+      <w:r>
+        <w:t xml:space="preserve">GHL and this file now match.</w:t>
       </w:r>
     </w:p>
     <w:p>

</xml_diff>